<commit_message>
feat: embed bilingual training and add graph walkthrough video
</commit_message>
<xml_diff>
--- a/docs/training/casa-pizza/Formation_Swarm_Casa_Pizza.docx
+++ b/docs/training/casa-pizza/Formation_Swarm_Casa_Pizza.docx
@@ -77,7 +77,7 @@
     </w:p>
     <w:p>
       <w:r>
-        <w:t>Public débutant. Édition du 8 octobre 2026. Les captures de production montrent un atelier à un exécutant et une recette du formateur. Les captures du plan à six tâches et des politiques montrent une démonstration de configuration, sans exécution de ces six tâches.</w:t>
+        <w:t>Public débutant. Édition du 9 octobre 2026. Les captures de production montrent un atelier à un exécutant et une recette du formateur. Les captures du plan à six tâches et des politiques montrent une démonstration de configuration, sans exécution de ces six tâches.</w:t>
       </w:r>
     </w:p>
     <w:p>
@@ -6435,12 +6435,249 @@
     </w:p>
     <w:p>
       <w:r>
-        <w:t>Référence atelier : projet-pizza/docs/FORMATEUR.md, docs/REFONTE.md, tests/test_app.py et tests/test_http.py. Les captures du 8 octobre 2026 montrent une version de développement ; les libellés peuvent évoluer. Aucun résultat de test n’est extrapolé à une autre installation.</w:t>
+        <w:t>Référence atelier : projet-pizza/docs/FORMATEUR.md, docs/REFONTE.md, tests/test_app.py et tests/test_http.py. Les captures du 9 octobre 2026 montrent une version de développement ; les libellés peuvent évoluer. Aucun résultat de test n’est extrapolé à une autre installation.</w:t>
       </w:r>
     </w:p>
     <w:p>
       <w:r>
         <w:t>Le kit exclut clés, sessions privées, bases de commandes et historique Git. Il ne réalise aucune publication et n’installe aucun service externe. Les rapports historiques du producteur restent en français et distinguent les contrôles non exécutés de la recette finale.</w:t>
+      </w:r>
+    </w:p>
+    <w:p>
+      <w:r>
+        <w:br w:type="page"/>
+      </w:r>
+    </w:p>
+    <w:p>
+      <w:pPr>
+        <w:pStyle w:val="Heading1"/>
+      </w:pPr>
+      <w:r>
+        <w:t>37 Tutoriels animés pour refaire le parcours</w:t>
+      </w:r>
+    </w:p>
+    <w:p>
+      <w:r>
+        <w:t>Ce complément conserve les 36 chapitres précédents. Ouvrez le lecteur hors ligne, choisissez un module et reproduisez une étape dans votre atelier avant de regarder la suite.</w:t>
+      </w:r>
+    </w:p>
+    <w:p>
+      <w:hyperlink r:id="rId32">
+        <w:r>
+          <w:rPr>
+            <w:u w:val="single"/>
+          </w:rPr>
+          <w:t>Ouvrir le lecteur pas à pas et les vidéos</w:t>
+        </w:r>
+      </w:hyperlink>
+    </w:p>
+    <w:p>
+      <w:r>
+        <w:drawing>
+          <wp:inline xmlns:a="http://schemas.openxmlformats.org/drawingml/2006/main" xmlns:pic="http://schemas.openxmlformats.org/drawingml/2006/picture">
+            <wp:extent cx="5577840" cy="3921919"/>
+            <wp:docPr id="28" name="Picture 28"/>
+            <wp:cNvGraphicFramePr>
+              <a:graphicFrameLocks noChangeAspect="1"/>
+            </wp:cNvGraphicFramePr>
+            <a:graphic>
+              <a:graphicData uri="http://schemas.openxmlformats.org/drawingml/2006/picture">
+                <pic:pic>
+                  <pic:nvPicPr>
+                    <pic:cNvPr id="0" name="03-client-fr-poster.jpg"/>
+                    <pic:cNvPicPr/>
+                  </pic:nvPicPr>
+                  <pic:blipFill>
+                    <a:blip r:embed="rId33"/>
+                    <a:stretch>
+                      <a:fillRect/>
+                    </a:stretch>
+                  </pic:blipFill>
+                  <pic:spPr>
+                    <a:xfrm>
+                      <a:off x="0" y="0"/>
+                      <a:ext cx="5577840" cy="3921919"/>
+                    </a:xfrm>
+                    <a:prstGeom prst="rect"/>
+                  </pic:spPr>
+                </pic:pic>
+              </a:graphicData>
+            </a:graphic>
+          </wp:inline>
+        </w:drawing>
+      </w:r>
+    </w:p>
+    <w:p>
+      <w:pPr>
+        <w:pStyle w:val="Caption"/>
+      </w:pPr>
+      <w:r>
+        <w:t>Légendes intégrées aux vidéos. Aucun son ni lancement automatique.</w:t>
+      </w:r>
+    </w:p>
+    <w:p>
+      <w:hyperlink r:id="rId34">
+        <w:r>
+          <w:rPr>
+            <w:u w:val="single"/>
+          </w:rPr>
+          <w:t>Du besoin au graphe · 24 s · chapitres 8–11 et 17–20</w:t>
+        </w:r>
+      </w:hyperlink>
+    </w:p>
+    <w:p>
+      <w:hyperlink r:id="rId35">
+        <w:r>
+          <w:rPr>
+            <w:u w:val="single"/>
+          </w:rPr>
+          <w:t>Préparer les contrôles Swarm · 24 s · chapitres 21–26</w:t>
+        </w:r>
+      </w:hyperlink>
+    </w:p>
+    <w:p>
+      <w:hyperlink r:id="rId36">
+        <w:r>
+          <w:rPr>
+            <w:u w:val="single"/>
+          </w:rPr>
+          <w:t>Commander et traiter un refus · 30 s · chapitres 27–30</w:t>
+        </w:r>
+      </w:hyperlink>
+    </w:p>
+    <w:p>
+      <w:hyperlink r:id="rId37">
+        <w:r>
+          <w:rPr>
+            <w:u w:val="single"/>
+          </w:rPr>
+          <w:t>Du restaurant au suivi client · 42 s · chapitres 31–34</w:t>
+        </w:r>
+      </w:hyperlink>
+    </w:p>
+    <w:p>
+      <w:r>
+        <w:t>Extraire entièrement le ZIP avant ouverture. Les MP4 peuvent aussi être ouverts directement dans tutoriels/media. Le GIF est un aperçu réduit ; le mode pas à pas garde chaque image à l’écran et la transcription fournit les explications.</w:t>
+      </w:r>
+    </w:p>
+    <w:p>
+      <w:r>
+        <w:br w:type="page"/>
+      </w:r>
+    </w:p>
+    <w:p>
+      <w:pPr>
+        <w:pStyle w:val="Heading1"/>
+      </w:pPr>
+      <w:r>
+        <w:t>38 Exercices corrigés et portée des images</w:t>
+      </w:r>
+    </w:p>
+    <w:p>
+      <w:r>
+        <w:t>Mettre en pause, répondre, puis vérifier. Les corrigés sont également accessibles dans le lecteur.</w:t>
+      </w:r>
+    </w:p>
+    <w:p>
+      <w:pPr>
+        <w:pStyle w:val="Heading2"/>
+      </w:pPr>
+      <w:r>
+        <w:t>1 Du besoin au graphe</w:t>
+      </w:r>
+    </w:p>
+    <w:p>
+      <w:r>
+        <w:rPr>
+          <w:b/>
+        </w:rPr>
+        <w:t>Quelle tâche doit précéder les tests ? Le graphe prouve-t-il une exécution ?</w:t>
+      </w:r>
+    </w:p>
+    <w:p>
+      <w:r>
+        <w:t>Commande et suivi précède Tests automatiques. Non : les six tâches sont non exécutées, sans agent actif. Le plan a été créé par le script pédagogique, séparément du besoin enregistré.</w:t>
+      </w:r>
+    </w:p>
+    <w:p>
+      <w:pPr>
+        <w:pStyle w:val="Heading2"/>
+      </w:pPr>
+      <w:r>
+        <w:t>2 Préparer les contrôles Swarm</w:t>
+      </w:r>
+    </w:p>
+    <w:p>
+      <w:r>
+        <w:rPr>
+          <w:b/>
+        </w:rPr>
+        <w:t>Une commande réussie suffit-elle à déclarer la mission terminée ?</w:t>
+      </w:r>
+    </w:p>
+    <w:p>
+      <w:r>
+        <w:t>Non. Elle apporte une preuve sur les fichiers et critères liés au candidat. La recette visuelle, la revue et les conditions d’acceptation restent distinctes. Dans cet enregistrement, aucune politique n’a été appliquée et aucune tâche n’a été acceptée.</w:t>
+      </w:r>
+    </w:p>
+    <w:p>
+      <w:pPr>
+        <w:pStyle w:val="Heading2"/>
+      </w:pPr>
+      <w:r>
+        <w:t>3 Commander et traiter un refus</w:t>
+      </w:r>
+    </w:p>
+    <w:p>
+      <w:r>
+        <w:rPr>
+          <w:b/>
+        </w:rPr>
+        <w:t>Pourquoi 12,40 euros livraison comprise ne suffisent-ils pas pour une pizza ?</w:t>
+      </w:r>
+    </w:p>
+    <w:p>
+      <w:r>
+        <w:t>Le minimum s’applique aux pizzas seules : 9,50 euros reste inférieur à 10 euros. La livraison de 2,90 euros ne compte pas dans ce minimum.</w:t>
+      </w:r>
+    </w:p>
+    <w:p>
+      <w:pPr>
+        <w:pStyle w:val="Heading2"/>
+      </w:pPr>
+      <w:r>
+        <w:t>4 Du restaurant au suivi client</w:t>
+      </w:r>
+    </w:p>
+    <w:p>
+      <w:r>
+        <w:rPr>
+          <w:b/>
+        </w:rPr>
+        <w:t>Qui a fait avancer la commande ? Comment vérifier que c’est la même ?</w:t>
+      </w:r>
+    </w:p>
+    <w:p>
+      <w:r>
+        <w:t>Le formateur, via les boutons du restaurant. Comparer numéro, contenu et total entre restaurant et client. Le parcours ne démontre ni livraison réelle ni agent autonome.</w:t>
+      </w:r>
+    </w:p>
+    <w:p>
+      <w:pPr>
+        <w:pStyle w:val="Heading2"/>
+      </w:pPr>
+      <w:r>
+        <w:t>Ce qui a réellement été enregistré</w:t>
+      </w:r>
+    </w:p>
+    <w:p>
+      <w:r>
+        <w:t>Le 9 octobre 2026, des actions ont été effectuées dans un cockpit et une application locale isolés. Les captures successives ont été assemblées en vidéos fixes et GIF avec légendes ; il ne s’agit pas d’une capture vidéo continue. Aucun fournisseur IA n’a été appelé pour cette démonstration.</w:t>
+      </w:r>
+    </w:p>
+    <w:p>
+      <w:r>
+        <w:t>Le besoin a été enregistré. Le plan pédagogique a été créé séparément par le script public, sans exécution des six tâches. Les politiques de contrôle ont été prévisualisées puis annulées. Le parcours client et les transitions restaurant ont réellement été joués avec des données fictives. Les onze tests de la référence ont réussi ; cela ne prouve pas une exécution autonome de la mission.</w:t>
       </w:r>
     </w:p>
     <w:sectPr>

</xml_diff>